<commit_message>
fix(security): unify double curly brace template syntax, harden generation_jobs RLS and approval route
</commit_message>
<xml_diff>
--- a/services/engine/fixtures/templates/CARTA_NOTARIA.docx
+++ b/services/engine/fixtures/templates/CARTA_NOTARIA.docx
@@ -14,7 +14,7 @@
     </w:p>
     <w:p>
       <w:r>
-        <w:t xml:space="preserve">{city}, {current_date}</w:t>
+        <w:t xml:space="preserve">{{city}}, {{current_date}}</w:t>
       </w:r>
     </w:p>
     <w:p>
@@ -24,7 +24,7 @@
     </w:p>
     <w:p>
       <w:r>
-        <w:t xml:space="preserve">Expediente N.° {case_number}</w:t>
+        <w:t xml:space="preserve">Expediente N.° {{case_number}}</w:t>
       </w:r>
     </w:p>
     <w:p>
@@ -34,12 +34,12 @@
     </w:p>
     <w:p>
       <w:r>
-        <w:t xml:space="preserve">Señores: {recipient_name}</w:t>
+        <w:t xml:space="preserve">Señores: {{recipient_name}}</w:t>
       </w:r>
     </w:p>
     <w:p>
       <w:r>
-        <w:t xml:space="preserve">Dirección: {recipient_address}</w:t>
+        <w:t xml:space="preserve">Dirección: {{recipient_address}}</w:t>
       </w:r>
     </w:p>
     <w:p>
@@ -49,17 +49,17 @@
     </w:p>
     <w:p>
       <w:r>
-        <w:t xml:space="preserve">De: {sender_name}</w:t>
+        <w:t xml:space="preserve">De: {{sender_name}}</w:t>
       </w:r>
     </w:p>
     <w:p>
       <w:r>
-        <w:t xml:space="preserve">DNI: {sender_document_number}</w:t>
+        <w:t xml:space="preserve">DNI: {{sender_document_number}}</w:t>
       </w:r>
     </w:p>
     <w:p>
       <w:r>
-        <w:t xml:space="preserve">Dirección: {sender_address}</w:t>
+        <w:t xml:space="preserve">Dirección: {{sender_address}}</w:t>
       </w:r>
     </w:p>
     <w:p>
@@ -69,7 +69,7 @@
     </w:p>
     <w:p>
       <w:r>
-        <w:t xml:space="preserve">ASUNTO: {subject}</w:t>
+        <w:t xml:space="preserve">ASUNTO: {{subject}}</w:t>
       </w:r>
     </w:p>
     <w:p>
@@ -79,7 +79,7 @@
     </w:p>
     <w:p>
       <w:r>
-        <w:t xml:space="preserve">{body}</w:t>
+        <w:t xml:space="preserve">{{body}}</w:t>
       </w:r>
     </w:p>
     <w:p>
@@ -99,12 +99,12 @@
     </w:p>
     <w:p>
       <w:r>
-        <w:t xml:space="preserve">{sender_name}</w:t>
+        <w:t xml:space="preserve">{{sender_name}}</w:t>
       </w:r>
     </w:p>
     <w:p>
       <w:r>
-        <w:t xml:space="preserve">DNI N.° {sender_document_number}</w:t>
+        <w:t xml:space="preserve">DNI N.° {{sender_document_number}}</w:t>
       </w:r>
     </w:p>
     <w:p>
@@ -114,7 +114,7 @@
     </w:p>
     <w:p>
       <w:r>
-        <w:t xml:space="preserve">Abogado: {lawyer_name}, Colegiatura {lawyer_colegiatura}</w:t>
+        <w:t xml:space="preserve">Abogado: {{lawyer_name}}, Colegiatura {{lawyer_colegiatura}}</w:t>
       </w:r>
     </w:p>
   </w:body>

</xml_diff>